<commit_message>
Fix four practice-test defects: incomplete PDF extraction, D36 unpriced lines, BOQ-content detectors, defaulted region/currency
- project_index: 'Extracted - incomplete' when a Quantity header and units have no numbers in the text layer
- D36 lists every unpriced/unmapped BOQ line; exceptions no longer headed 'resolved'
- detectors scan all imported text columns, extra markers, near-duplicate sizes
- migration 0016 projects.basis_defaulted; confirm_basis/action; banner, completeness, readiness gate
- 6 regression tests; 3 fixtures now pass region/currency explicitly; practice test re-run; full suite 464 passed

Co-Authored-By: Claude Sonnet 5.5 <noreply@anthropic.com>
Claude-Session: https://claude.ai/code/session_01ShGswK3SJJeEsEzfdZjprk
</commit_message>
<xml_diff>
--- a/practice_test/real_document/generated/PRJ-9201_tender_pack_r1/PRJ-9201-D07_r1_Pricing-basis-and-basis-of-estimate-BOE.docx
+++ b/practice_test/real_document/generated/PRJ-9201_tender_pack_r1/PRJ-9201-D07_r1_Pricing-basis-and-basis-of-estimate-BOE.docx
@@ -432,7 +432,7 @@
           </w:tcPr>
           <w:p>
             <w:r>
-              <w:t>{"id": "PRJ-9201", "name": "PRACTICE TEST - Sample residential building (third-party sample BOQ)", "client": "NONE - practice exercise", "location": "not stated in the document (document uses INR and IS 1200: India)", "region": "KSA-ALL", "currency": "SAR", "tender_ref": "PRACTICE-TEST-NOT-A-TEND...</w:t>
+              <w:t>{"id": "PRJ-9201", "name": "PRACTICE TEST - Sample residential building (third-party sample BOQ)", "client": "NONE - practice exercise", "location": "not stated in the document (document uses INR and IS 1200: India)", "region": "KSA-ALL", "currency": "SAR", "basis_confirmed": false, "tender_ref":...</w:t>
             </w:r>
           </w:p>
         </w:tc>
@@ -454,7 +454,7 @@
           </w:tcPr>
           <w:p>
             <w:r>
-              <w:t>["DEMONSTRATION PROJECT - SYNTHETIC DATA - NOT A MARKET QUOTE", "ESTIMATE STATE: PRELIMINARY — INCOMPLETE - NOT FOR SUBMISSION", "PROJECT NOTE: PRACTICE TEST - NOT A TENDER - NOT FOR SUBMISSION. Third-party sample BOQ; quantities TRANSCRIBED, NOT VERIFIED; no rates, no productivity values."]</w:t>
+              <w:t>["DEMONSTRATION PROJECT - SYNTHETIC DATA - NOT A MARKET QUOTE", "ESTIMATE STATE: PRELIMINARY — INCOMPLETE - NOT FOR SUBMISSION", "REGION / CURRENCY (KSA-ALL / SAR) ARE SYSTEM DEFAULTS - NOT CONFIRMED BY A PERSON", "PROJECT NOTE: PRACTICE TEST - NOT A TENDER - NOT FOR SUBMISSION. Third-party sampl...</w:t>
             </w:r>
           </w:p>
         </w:tc>
@@ -498,7 +498,7 @@
           </w:tcPr>
           <w:p>
             <w:r>
-              <w:t>{"boq_imports": [{"revision": null, "source_file": "BOQ_TRANSCRIBED_FROM_PDF_UNVERIFIED.csv", "sha256": "83a1dbe4b0c1ec40a25c2a56c25e7ebbfed0c6b6ff31ca92d2ce73b017505990", "imported_by": "test-estimator", "imported_at": "2026-10-14T19:40:29+00:00", "summary_json": "{\"blank\": 0, \"by_trade\": {\...</w:t>
+              <w:t>{"boq_imports": [{"revision": null, "source_file": "BOQ_TRANSCRIBED_FROM_PDF_UNVERIFIED.csv", "sha256": "83a1dbe4b0c1ec40a25c2a56c25e7ebbfed0c6b6ff31ca92d2ce73b017505990", "imported_by": "test-estimator", "imported_at": "2026-10-14T21:36:27+00:00", "summary_json": "{\"blank\": 0, \"by_trade\": {\...</w:t>
             </w:r>
           </w:p>
         </w:tc>

</xml_diff>